<commit_message>
Aplica os nits da Tabela 1 pedidos pelos pareceristas.
MAE de 8 h como 32,0; título sem «no teste»; NS de teste no cabeçalho; Nota declara equilíbrio ≠ mínimo dos PERS; identificadores MATLAB ficam só no parágrafo.

Co-authored-by: juliana carolino carolino reis <juliana.reis@ufrgs.br>
</commit_message>
<xml_diff>
--- a/pesquisas/manuscrito-drive.docx
+++ b/pesquisas/manuscrito-drive.docx
@@ -112,7 +112,7 @@
           <w:color w:val="000000"/>
           <w:sz w:val="24"/>
         </w:rPr>
-        <w:t>O objetivo deste estudo foi avaliar o desempenho de redes neurais artificiais (RNAs) na previsão horária de nível na estação fluviométrica Santa Tereza (ANA/SGB 86472600), na bacia do rio Taquari-Antas, Rio Grande do Sul, Brasil, nos horizontes de 2, 4, 8 e 12 h. Os procedimentos adotados foram: i) organização do inventário de perceptrons de três camadas já treinados em MATLAB; ii) qualificação das redes com índice de persistência (PERS) positivo em treino, validação, teste e série completa, resultando em 282 modelos; iii) descrição das principais combinações de variáveis de entrada, sem métricas; iv) seleção de um único modelo por horizonte pelo índice de equilíbrio publicado no inventário; v) avaliação quantitativa por PERS, coeficiente de Nash-Sutcliffe (NS), erro absoluto médio (MAE) e percentil 95 do erro absoluto (E95). O modelo de 2 h, com 15 entradas de nível local e de montante e sem precipitação, apresentou índice de equilíbrio 0,969, NS de teste 0,996, MAE de 3,5 cm e E95 de 10,4 cm. Em 4 h, o modelo selecionado possui 24 entradas, incluindo a chuva média acumulada em 36 h (equilíbrio 0,846; NS 0,993; MAE 13,9 cm). Em 8 h, a RNA com 10 entradas (combinação C0289) atingiu equilíbrio 0,694, NS 0,940 e MAE 32 cm. Em 12 h, o modelo selecionado (C0149) atingiu equilíbrio 0,690, NS 0,885 e MAE 40,9 cm. Conclui-se que as RNAs reproduzem o nível na régua com ganho sobre a persistência nos quatro horizontes quando a seleção exige equilíbrio entre partições. O NS isolado de uma partição e o erro de uma janela do serviço experimental não substituem o teste por eventos de cheia.</w:t>
+        <w:t>O objetivo deste estudo foi avaliar o desempenho de redes neurais artificiais (RNAs) na previsão horária de nível na estação fluviométrica Santa Tereza (ANA/SGB 86472600), na bacia do rio Taquari-Antas, Rio Grande do Sul, Brasil, nos horizontes de 2, 4, 8 e 12 h. Os procedimentos adotados foram: i) organização do inventário de perceptrons de três camadas já treinados em MATLAB; ii) qualificação das redes com índice de persistência (PERS) positivo em treino, validação, teste e série completa, resultando em 282 modelos; iii) descrição das principais combinações de variáveis de entrada, sem métricas; iv) seleção de um único modelo por horizonte pelo índice de equilíbrio publicado no inventário; v) avaliação quantitativa por PERS, coeficiente de Nash-Sutcliffe (NS), erro absoluto médio (MAE) e percentil 95 do erro absoluto (E95). O modelo de 2 h, com 15 entradas de nível local e de montante e sem precipitação, apresentou índice de equilíbrio 0,969, NS de teste 0,996, MAE de 3,5 cm e E95 de 10,4 cm. Em 4 h, o modelo selecionado possui 24 entradas, incluindo a chuva média acumulada em 36 h (equilíbrio 0,846; NS 0,993; MAE 13,9 cm). Em 8 h, a RNA com 10 entradas (combinação C0289) atingiu equilíbrio 0,694, NS 0,940 e MAE 32,0 cm. Em 12 h, o modelo selecionado (C0149) atingiu equilíbrio 0,690, NS 0,885 e MAE 40,9 cm. Conclui-se que as RNAs reproduzem o nível na régua com ganho sobre a persistência nos quatro horizontes quando a seleção exige equilíbrio entre partições. O NS isolado de uma partição e o erro de uma janela do serviço experimental não substituem o teste por eventos de cheia.</w:t>
       </w:r>
     </w:p>
     <w:p>
@@ -169,7 +169,7 @@
           <w:color w:val="000000"/>
           <w:sz w:val="24"/>
         </w:rPr>
-        <w:t>The aim of this study was to evaluate artificial neural networks (ANNs) for hourly water-level forecasting at the Santa Tereza gauging station (ANA/SGB 86472600), Taquari-Antas River basin, Rio Grande do Sul, Brazil, at 2, 4, 8 and 12 h lead times. The procedures were: i) organisation of an inventory of three-layer perceptrons already trained in MATLAB; ii) retention of networks with positive persistence index (PERS) on training, validation, testing and the full series (282 models); iii) description of the main input combinations, without performance metrics; iv) selection of one model per horizon by the published equilibrium score; v) evaluation using PERS, the Nash-Sutcliffe coefficient (NS), mean absolute error (MAE) and the 95th percentile of absolute error (E95). The 2 h model, with 15 local and upstream stage inputs and no rainfall, attained an equilibrium score of 0.969, NS of 0.996, MAE of 3.5 cm and E95 of 10.4 cm. At 4 h the selected model has 24 inputs including 36 h mean accumulated rainfall (equilibrium 0.846; NS 0.993; MAE 13.9 cm). At 8 h the 10-input network (combination C0289) reached 0.694, NS 0.940 and MAE 32 cm. At 12 h the selected model reached 0.690, NS 0.885 and MAE 40.9 cm. ANNs reproduce stage with skill over persistence at all four horizons when selection requires balance across partitions. Partition-wise NS and the error of an experimental-service window do not replace event-based testing.</w:t>
+        <w:t>The aim of this study was to evaluate artificial neural networks (ANNs) for hourly water-level forecasting at the Santa Tereza gauging station (ANA/SGB 86472600), Taquari-Antas River basin, Rio Grande do Sul, Brazil, at 2, 4, 8 and 12 h lead times. The procedures were: i) organisation of an inventory of three-layer perceptrons already trained in MATLAB; ii) retention of networks with positive persistence index (PERS) on training, validation, testing and the full series (282 models); iii) description of the main input combinations, without performance metrics; iv) selection of one model per horizon by the published equilibrium score; v) evaluation using PERS, the Nash-Sutcliffe coefficient (NS), mean absolute error (MAE) and the 95th percentile of absolute error (E95). The 2 h model, with 15 local and upstream stage inputs and no rainfall, attained an equilibrium score of 0.969, NS of 0.996, MAE of 3.5 cm and E95 of 10.4 cm. At 4 h the selected model has 24 inputs including 36 h mean accumulated rainfall (equilibrium 0.846; NS 0.993; MAE 13.9 cm). At 8 h the 10-input network (combination C0289) reached 0.694, NS 0.940 and MAE 32.0 cm. At 12 h the selected model reached 0.690, NS 0.885 and MAE 40.9 cm. ANNs reproduce stage with skill over persistence at all four horizons when selection requires balance across partitions. Partition-wise NS and the error of an experimental-service window do not replace event-based testing.</w:t>
       </w:r>
     </w:p>
     <w:p>
@@ -2775,7 +2775,7 @@
           <w:color w:val="000000"/>
           <w:sz w:val="20"/>
         </w:rPr>
-        <w:t xml:space="preserve"> – Desempenho no teste do modelo de maior equilíbrio publicado em cada horizonte</w:t>
+        <w:t xml:space="preserve"> – Desempenho do modelo de maior equilíbrio publicado em cada horizonte</w:t>
       </w:r>
     </w:p>
     <w:tbl>
@@ -2957,6 +2957,19 @@
                 <w:sz w:val="20"/>
               </w:rPr>
               <w:t>NS</w:t>
+            </w:r>
+            <w:r>
+              <w:br/>
+            </w:r>
+            <w:r>
+              <w:rPr>
+                <w:rFonts w:ascii="Times New Roman" w:hAnsi="Times New Roman" w:eastAsia="Times New Roman"/>
+                <w:b/>
+                <w:i w:val="0"/>
+                <w:color w:val="000000"/>
+                <w:sz w:val="20"/>
+              </w:rPr>
+              <w:t>(teste)</w:t>
             </w:r>
           </w:p>
         </w:tc>
@@ -3624,7 +3637,7 @@
                 <w:color w:val="000000"/>
                 <w:sz w:val="20"/>
               </w:rPr>
-              <w:t>32</w:t>
+              <w:t>32,0</w:t>
             </w:r>
           </w:p>
         </w:tc>
@@ -3915,7 +3928,7 @@
           <w:color w:val="000000"/>
           <w:sz w:val="20"/>
         </w:rPr>
-        <w:t>NS = coeficiente de Nash-Sutcliffe no teste. MAE e E95 no teste por eventos, em centímetros na régua. ALT: a rede prevê a variação do nível. CONV: família complementar (equação de saída a declarar). Identificadores MATLAB: 2 h = 009_alt_STZ_2H_R09_T10-15-16_V1-5-12-17-21; 4 h = V01_R10_T19-21_V1-3-5-15-17_nh48_nit10_cic100000; 8 h = altR_004_08_8h_alt_8H_ALT_C0289; 12 h = 004_conv_C0149_R01_T2_V1_3. Chuva de 36 h ausente só em 2 h. Entradas / neurônios ocultos: 15/30, 24/48, 10/20 e 14/28.</w:t>
+        <w:t>Equilíbrio é o campo publicado na ficha, não o mínimo dos três PERS; a ordem na coluna PERS é geral / validação / teste. NS = coeficiente de Nash-Sutcliffe no teste. MAE e E95 no teste por eventos, em centímetros na régua. ALT: a rede prevê a variação do nível. CONV: família complementar (equação de saída a declarar). Chuva de 36 h ausente só em 2 h. Entradas / neurônios ocultos: 15/30, 24/48, 10/20 e 14/28.</w:t>
       </w:r>
     </w:p>
     <w:p>
@@ -3931,7 +3944,7 @@
           <w:color w:val="000000"/>
           <w:sz w:val="24"/>
         </w:rPr>
-        <w:t>Em 2 h a única montagem do conjunto filtrado (15 entradas de nível, sem chuva, 30 neurônios) gerou dez rotações de eventos; todas têm equilíbrio acima de 0,90 também quando se reaplica o mínimo dos três PERS. O modelo selecionado testa os eventos 10, 15 e 16 e é a rede em operação experimental contínua — fato de implantação, não evidência adicional de teste. O MAE de teste da ficha (3,5 cm em 2 h; 13,9 cm em 4 h; 32 cm em 8 h) não é o MAE de uma janela móvel do serviço experimental: são contratos distintos (partição por eventos de cheia versus pares recentes conferidos no feed).</w:t>
+        <w:t>Em 2 h a única montagem do conjunto filtrado (15 entradas de nível, sem chuva, 30 neurônios) gerou dez rotações de eventos; todas têm equilíbrio acima de 0,90 também quando se reaplica o mínimo dos três PERS. O modelo selecionado testa os eventos 10, 15 e 16 e é a rede em operação experimental contínua — fato de implantação, não evidência adicional de teste. O MAE de teste da ficha (3,5 cm em 2 h; 13,9 cm em 4 h; 32,0 cm em 8 h) não é o MAE de uma janela móvel do serviço experimental: são contratos distintos (partição por eventos de cheia versus pares recentes conferidos no feed).</w:t>
       </w:r>
     </w:p>
     <w:p>
@@ -4075,7 +4088,7 @@
           <w:color w:val="000000"/>
           <w:sz w:val="24"/>
         </w:rPr>
-        <w:t>3. Em 8 h, o modelo selecionado é ALT C0289 (altR_004_08_8h_alt_8H_ALT_C0289; equilíbrio 0,694; NS 0,940; MAE 32 cm). A CONV da mesma combinação, quando equilibra, reduz o E95 — ressalva da discussão, não segundo resultado.</w:t>
+        <w:t>3. Em 8 h, o modelo selecionado é ALT C0289 (altR_004_08_8h_alt_8H_ALT_C0289; equilíbrio 0,694; NS 0,940; MAE 32,0 cm). A CONV da mesma combinação, quando equilibra, reduz o E95 — ressalva da discussão, não segundo resultado.</w:t>
       </w:r>
     </w:p>
     <w:p>

</xml_diff>